<commit_message>
docs: finalize Word document with bubble-style list design
</commit_message>
<xml_diff>
--- a/docs/Mana-产品需求分析文档.docx
+++ b/docs/Mana-产品需求分析文档.docx
@@ -76,17 +76,17 @@
         <w:pStyle w:val="Heading2"/>
       </w:pPr>
       <w:r>
-        <w:t>3.2 任务球 (Task Orbs) 物理交互系统</w:t>
+        <w:t>3.2 任务列表 (Bubble-Style List) 交互系统</w:t>
       </w:r>
     </w:p>
     <w:p>
       <w:r>
-        <w:t>• 灵动悬浮：任务以球体形式存在，具有呼吸感。</w:t>
+        <w:t>• 气泡列表：任务以列表形式呈现以确保直观查阅，但单个任务项采用“气泡/球体”视觉包裹，具备轻微的悬浮动态效果。</w:t>
       </w:r>
     </w:p>
     <w:p>
       <w:r>
-        <w:t>• 物理属性：球体间存在碰撞、引力感，通过重力感应或手势交互模拟物理世界。</w:t>
+        <w:t>• 物理交互：列表项在滑动时具有软弹性质感，模拟气泡碰撞的物理反馈，保留魔法感。</w:t>
       </w:r>
     </w:p>
     <w:p>

</xml_diff>

<commit_message>
docs: integrate explosion effects, smart care prompts, and drag-and-drop sorting
</commit_message>
<xml_diff>
--- a/docs/Mana-产品需求分析文档.docx
+++ b/docs/Mana-产品需求分析文档.docx
@@ -72,6 +72,11 @@
       </w:r>
     </w:p>
     <w:p>
+      <w:r>
+        <w:t>• 爆炸反馈：任务完成时，原本包裹任务的气泡将触发“爆炸”扩散粒子动效，象征能量的释放。</w:t>
+      </w:r>
+    </w:p>
+    <w:p>
       <w:pPr>
         <w:pStyle w:val="Heading2"/>
       </w:pPr>
@@ -81,12 +86,17 @@
     </w:p>
     <w:p>
       <w:r>
-        <w:t>• 气泡列表：任务以列表形式呈现以确保直观查阅，但单个任务项采用“气泡/球体”视觉包裹，具备轻微的悬浮动态效果。</w:t>
+        <w:t>• 排序与优先级：默认按创建时间排序；用户可在创建时设置优先级，或通过在列表中自由拖拽任务项来实时调整优先级。</w:t>
       </w:r>
     </w:p>
     <w:p>
       <w:r>
-        <w:t>• 物理交互：列表项在滑动时具有软弹性质感，模拟气泡碰撞的物理反馈，保留魔法感。</w:t>
+        <w:t>• 气泡列表：任务以列表形式呈现确保直观，但单个任务项采用气泡视觉包裹。</w:t>
+      </w:r>
+    </w:p>
+    <w:p>
+      <w:r>
+        <w:t>• 物理交互：列表项在滑动时具有软粘性质感，模拟物理反馈。</w:t>
       </w:r>
     </w:p>
     <w:p>
@@ -94,7 +104,7 @@
         <w:pStyle w:val="Heading2"/>
       </w:pPr>
       <w:r>
-        <w:t>3.3 动态能量流转与反馈</w:t>
+        <w:t>3.3 动态能量流转与智能关怀提示</w:t>
       </w:r>
     </w:p>
     <w:p>
@@ -105,6 +115,11 @@
     <w:p>
       <w:r>
         <w:t>• 实时反馈：任务完成时伴随光晕扩散、能量汇聚等魔法化动效。</w:t>
+      </w:r>
+    </w:p>
+    <w:p>
+      <w:r>
+        <w:t>• 智能提醒：系统建立关怀提示词库，实时监测每日任务完成量。当用户过度劳累时，随机弹出库中的温馨或幽默词句，提醒休息。</w:t>
       </w:r>
     </w:p>
     <w:p>

</xml_diff>

<commit_message>
docs: confirm serverless frontend-only architecture with local storage
</commit_message>
<xml_diff>
--- a/docs/Mana-产品需求分析文档.docx
+++ b/docs/Mana-产品需求分析文档.docx
@@ -163,7 +163,17 @@
         <w:pStyle w:val="Heading1"/>
       </w:pPr>
       <w:r>
-        <w:t>5. 技术约束与交互要求</w:t>
+        <w:t>5. 技术架构与交互要求</w:t>
+      </w:r>
+    </w:p>
+    <w:p>
+      <w:r>
+        <w:t>• 架构方案：无后端纯前端架构 (Serverless Frontend-Only)。系统完全运行在用户苹果手机本地，无需外部服务器支持。</w:t>
+      </w:r>
+    </w:p>
+    <w:p>
+      <w:r>
+        <w:t>• 数据持久化：利用浏览器 LocalStorage 或 IndexedDB 实现本地持久化方案，确保用户数据安全存储于设备本地且支持离线使用。</w:t>
       </w:r>
     </w:p>
     <w:p>

</xml_diff>

<commit_message>
docs: huge update - time concept, dual themes, and UI scaling
</commit_message>
<xml_diff>
--- a/docs/Mana-产品需求分析文档.docx
+++ b/docs/Mana-产品需求分析文档.docx
@@ -58,22 +58,22 @@
         <w:pStyle w:val="Heading2"/>
       </w:pPr>
       <w:r>
-        <w:t>3.1 能量驱动的任务系统</w:t>
+        <w:t>3.1 时间驱动的任务系统</w:t>
       </w:r>
     </w:p>
     <w:p>
       <w:r>
-        <w:t>• Mana值分配：每个任务需绑定特定的能量消耗权重。</w:t>
+        <w:t>• 任务时长分配：将原有的能量值概念转化为实用的“所需时间（分钟）”，支持 1-300 分钟设定。</w:t>
       </w:r>
     </w:p>
     <w:p>
       <w:r>
-        <w:t>• 可视化消耗：随着任务进度，总 Mana 池呈现动态流转效果。</w:t>
+        <w:t>• 可视化进度：界面直观呈现每日积累的产出时间对比，增强掌控感。</w:t>
       </w:r>
     </w:p>
     <w:p>
       <w:r>
-        <w:t>• 爆炸反馈：任务完成时，原本包裹任务的气泡将触发“爆炸”扩散粒子动效，象征能量的释放。</w:t>
+        <w:t>• 膨胀与爆炸反馈：任务完成时触发 2-3s 的气泡膨胀动效，模拟压力积聚后释放的物理质感，随后触发粒子爆炸销毁。</w:t>
       </w:r>
     </w:p>
     <w:p>
@@ -81,22 +81,22 @@
         <w:pStyle w:val="Heading2"/>
       </w:pPr>
       <w:r>
-        <w:t>3.2 任务列表 (Bubble-Style List) 交互系统</w:t>
+        <w:t>3.2 任务列表与排序系统</w:t>
       </w:r>
     </w:p>
     <w:p>
       <w:r>
-        <w:t>• 排序与优先级：默认按创建时间排序；用户可在创建时设置优先级，或通过在列表中自由拖拽任务项来实时调整优先级。</w:t>
+        <w:t>• 多维排序：支持按创建时间、所需时长进行升序/降序排列。</w:t>
       </w:r>
     </w:p>
     <w:p>
       <w:r>
-        <w:t>• 气泡列表：任务以列表形式呈现确保直观，但单个任务项采用气泡视觉包裹。</w:t>
+        <w:t>• 气泡列表：任务项采用圆润透明的气泡包裹，列表项显示创建的具体时间点。</w:t>
       </w:r>
     </w:p>
     <w:p>
       <w:r>
-        <w:t>• 物理交互：列表项在滑动时具有软粘性质感，模拟物理反馈。</w:t>
+        <w:t>• 比例优化：针对 iOS 用户调大全局字体与交互组件比例，确保单手操作的准确性。</w:t>
       </w:r>
     </w:p>
     <w:p>
@@ -140,22 +140,22 @@
         <w:pStyle w:val="Heading1"/>
       </w:pPr>
       <w:r>
-        <w:t>4. 视觉语言规范</w:t>
+        <w:t>4. 视觉语言与多主题支持</w:t>
       </w:r>
     </w:p>
     <w:p>
       <w:r>
-        <w:t>• 关键词：灵动、空灵、通透、秩序、魔法。</w:t>
+        <w:t>• 关键词：灵动、空灵、平衡、双相。</w:t>
       </w:r>
     </w:p>
     <w:p>
       <w:r>
-        <w:t>• 色彩方案：深层蓝 (Deep Blue)、神秘靛 (Indigo)、优雅紫 (Purple)、纯净白 (Clear White)。</w:t>
+        <w:t>• 双色模式：支持亮色 (Light) 与暗色 (Dark) 两套视觉系统，满足全天候使用场景。</w:t>
       </w:r>
     </w:p>
     <w:p>
       <w:r>
-        <w:t>• 设计元素：玻璃态 (Glassmorphism)、光晕 (Aura)、微动效 (Micro-animations)。</w:t>
+        <w:t>• 设计元素：玻璃态 (Glassmorphism)、微动效 (Micro-animations)、大气泡感。</w:t>
       </w:r>
     </w:p>
     <w:p>

</xml_diff>

<commit_message>
docs: finalize smart care triggers and requirement details
</commit_message>
<xml_diff>
--- a/docs/Mana-产品需求分析文档.docx
+++ b/docs/Mana-产品需求分析文档.docx
@@ -104,22 +104,32 @@
         <w:pStyle w:val="Heading2"/>
       </w:pPr>
       <w:r>
-        <w:t>3.3 动态能量流转与智能关怀提示</w:t>
+        <w:t>3.3 动态动效与智能关怀提示</w:t>
       </w:r>
     </w:p>
     <w:p>
       <w:r>
-        <w:t>• 能量滑动条：用户可通过滑动条实时感知任务对总能量平衡的影响。</w:t>
+        <w:t>• 膨胀与爆炸反馈：任务完成时触发 2-3s 的气泡膨胀动效，模拟压力积聚后释放的物理质感。</w:t>
       </w:r>
     </w:p>
     <w:p>
       <w:r>
-        <w:t>• 实时反馈：任务完成时伴随光晕扩散、能量汇聚等魔法化动效。</w:t>
+        <w:t>• 智能提醒触发方案：系统根据以下三个维度实时监测并随机弹出关怀提示词：</w:t>
       </w:r>
     </w:p>
     <w:p>
       <w:r>
-        <w:t>• 智能提醒：系统建立关怀提示词库，实时监测每日任务完成量。当用户过度劳累时，随机弹出库中的温馨或幽默词句，提醒休息。</w:t>
+        <w:t xml:space="preserve">  1. 累计数量：每日累计每完成 5 个任务；</w:t>
+      </w:r>
+    </w:p>
+    <w:p>
+      <w:r>
+        <w:t xml:space="preserve">  2. 累计时长：每日累计任务总时长达到 120 分钟或其倍数；</w:t>
+      </w:r>
+    </w:p>
+    <w:p>
+      <w:r>
+        <w:t xml:space="preserve">  3. 高频强度：30 分钟内连续完成 3 项及以上任务。</w:t>
       </w:r>
     </w:p>
     <w:p>

</xml_diff>

<commit_message>
feat: finalize iOS visual polish, 1.8s animation, full date display, and expired task cleanup
</commit_message>
<xml_diff>
--- a/docs/Mana-产品需求分析文档.docx
+++ b/docs/Mana-产品需求分析文档.docx
@@ -29,7 +29,7 @@
     </w:p>
     <w:p>
       <w:r>
-        <w:t>Mana 是一款旨在打破传统“枯燥列表式”任务管理的创新应用。它将抽象的任务管理具象化为“能量管理”，通过物理引擎、魔法化视觉和灵动音效，为用户提供一种掌控感与愉悦感并存的效率体验。</w:t>
+        <w:t>Mana 是一款针对 iOS 极致优化的效率工具，通过魔法动效与能量管理理念，将枯燥的任务管理转化为愉悦的感官体验。</w:t>
       </w:r>
     </w:p>
     <w:p>
@@ -37,12 +37,61 @@
         <w:pStyle w:val="Heading1"/>
       </w:pPr>
       <w:r>
-        <w:t>2. 目标用户</w:t>
+        <w:t>2. 核心功能需求</w:t>
+      </w:r>
+    </w:p>
+    <w:p>
+      <w:pPr>
+        <w:pStyle w:val="Heading2"/>
+      </w:pPr>
+      <w:r>
+        <w:t>2.1 高级动效与交互</w:t>
       </w:r>
     </w:p>
     <w:p>
       <w:r>
-        <w:t>主要面向追求审美、重视心理平衡、活跃于 iOS 生态系统的创造者、职场精英及极简主义者。</w:t>
+        <w:t>• 紧凑爆炸反馈：任务完成触发 1.8s 的强化爆炸动效（0.8s 膨胀 + 1.0s 粒子喷发）。</w:t>
+      </w:r>
+    </w:p>
+    <w:p>
+      <w:r>
+        <w:t>• 过期任务一键清理：支持清除超过 7 天未完成的积压任务。</w:t>
+      </w:r>
+    </w:p>
+    <w:p>
+      <w:pPr>
+        <w:pStyle w:val="Heading2"/>
+      </w:pPr>
+      <w:r>
+        <w:t>2.2 iOS 风格视觉优化</w:t>
+      </w:r>
+    </w:p>
+    <w:p>
+      <w:r>
+        <w:t>• 苹果美学配色：精调全局字体颜色、亮度和对比度，确保在亮/暗模式下均符合 iOS 高端用户习惯。</w:t>
+      </w:r>
+    </w:p>
+    <w:p>
+      <w:r>
+        <w:t>• 增强时间戳显示：任务列表显示完整的“年-月-日 时:分”时间标记。</w:t>
+      </w:r>
+    </w:p>
+    <w:p>
+      <w:pPr>
+        <w:pStyle w:val="Heading2"/>
+      </w:pPr>
+      <w:r>
+        <w:t>2.3 能量管理与排序</w:t>
+      </w:r>
+    </w:p>
+    <w:p>
+      <w:r>
+        <w:t>• 时间驱动模型：任务以所需时间（1-300min）为核心单位。</w:t>
+      </w:r>
+    </w:p>
+    <w:p>
+      <w:r>
+        <w:t>• 智能关怀监测：基于数量、时长、频率三大维度的压力监测与休息提示。</w:t>
       </w:r>
     </w:p>
     <w:p>
@@ -50,99 +99,17 @@
         <w:pStyle w:val="Heading1"/>
       </w:pPr>
       <w:r>
-        <w:t>3. 核心功能需求</w:t>
-      </w:r>
-    </w:p>
-    <w:p>
-      <w:pPr>
-        <w:pStyle w:val="Heading2"/>
-      </w:pPr>
-      <w:r>
-        <w:t>3.1 时间驱动的任务系统</w:t>
+        <w:t>3. 视觉语言</w:t>
       </w:r>
     </w:p>
     <w:p>
       <w:r>
-        <w:t>• 任务时长分配：将原有的能量值概念转化为实用的“所需时间（分钟）”，支持 1-300 分钟设定。</w:t>
+        <w:t>• 双色模式：深度定制的 Light &amp; Dark 系统。</w:t>
       </w:r>
     </w:p>
     <w:p>
       <w:r>
-        <w:t>• 可视化进度：界面直观呈现每日积累的产出时间对比，增强掌控感。</w:t>
-      </w:r>
-    </w:p>
-    <w:p>
-      <w:r>
-        <w:t>• 膨胀与爆炸反馈：任务完成时触发 2-3s 的气泡膨胀动效，模拟压力积聚后释放的物理质感，随后触发粒子爆炸销毁。</w:t>
-      </w:r>
-    </w:p>
-    <w:p>
-      <w:pPr>
-        <w:pStyle w:val="Heading2"/>
-      </w:pPr>
-      <w:r>
-        <w:t>3.2 任务列表与排序系统</w:t>
-      </w:r>
-    </w:p>
-    <w:p>
-      <w:r>
-        <w:t>• 多维排序：支持按创建时间、所需时长进行升序/降序排列。</w:t>
-      </w:r>
-    </w:p>
-    <w:p>
-      <w:r>
-        <w:t>• 气泡列表：任务项采用圆润透明的气泡包裹，列表项显示创建的具体时间点。</w:t>
-      </w:r>
-    </w:p>
-    <w:p>
-      <w:r>
-        <w:t>• 比例优化：针对 iOS 用户调大全局字体与交互组件比例，确保单手操作的准确性。</w:t>
-      </w:r>
-    </w:p>
-    <w:p>
-      <w:pPr>
-        <w:pStyle w:val="Heading2"/>
-      </w:pPr>
-      <w:r>
-        <w:t>3.3 动态动效与智能关怀提示</w:t>
-      </w:r>
-    </w:p>
-    <w:p>
-      <w:r>
-        <w:t>• 膨胀与爆炸反馈：任务完成时触发 2-3s 的气泡膨胀动效，模拟压力积聚后释放的物理质感。</w:t>
-      </w:r>
-    </w:p>
-    <w:p>
-      <w:r>
-        <w:t>• 智能提醒触发方案：系统根据以下三个维度实时监测并随机弹出关怀提示词：</w:t>
-      </w:r>
-    </w:p>
-    <w:p>
-      <w:r>
-        <w:t xml:space="preserve">  1. 累计数量：每日累计每完成 5 个任务；</w:t>
-      </w:r>
-    </w:p>
-    <w:p>
-      <w:r>
-        <w:t xml:space="preserve">  2. 累计时长：每日累计任务总时长达到 120 分钟或其倍数；</w:t>
-      </w:r>
-    </w:p>
-    <w:p>
-      <w:r>
-        <w:t xml:space="preserve">  3. 高频强度：30 分钟内连续完成 3 项及以上任务。</w:t>
-      </w:r>
-    </w:p>
-    <w:p>
-      <w:pPr>
-        <w:pStyle w:val="Heading2"/>
-      </w:pPr>
-      <w:r>
-        <w:t>3.4 艺术化产出分享</w:t>
-      </w:r>
-    </w:p>
-    <w:p>
-      <w:r>
-        <w:t>• 定制卡片：将一天的生产力数据转化为极致简约的视觉卡片，便于社交分享。</w:t>
+        <w:t>• 交互规范：超大操作热区，更适合大屏幕 iOS 设备单手操作。</w:t>
       </w:r>
     </w:p>
     <w:p>
@@ -150,55 +117,17 @@
         <w:pStyle w:val="Heading1"/>
       </w:pPr>
       <w:r>
-        <w:t>4. 视觉语言与多主题支持</w:t>
+        <w:t>4. 技术栈</w:t>
       </w:r>
     </w:p>
     <w:p>
       <w:r>
-        <w:t>• 关键词：灵动、空灵、平衡、双相。</w:t>
+        <w:t>• 纯前端架构 (React + TS + Vite + Framer Motion)。</w:t>
       </w:r>
     </w:p>
     <w:p>
       <w:r>
-        <w:t>• 双色模式：支持亮色 (Light) 与暗色 (Dark) 两套视觉系统，满足全天候使用场景。</w:t>
-      </w:r>
-    </w:p>
-    <w:p>
-      <w:r>
-        <w:t>• 设计元素：玻璃态 (Glassmorphism)、微动效 (Micro-animations)、大气泡感。</w:t>
-      </w:r>
-    </w:p>
-    <w:p>
-      <w:pPr>
-        <w:pStyle w:val="Heading1"/>
-      </w:pPr>
-      <w:r>
-        <w:t>5. 技术架构与交互要求</w:t>
-      </w:r>
-    </w:p>
-    <w:p>
-      <w:r>
-        <w:t>• 架构方案：无后端纯前端架构 (Serverless Frontend-Only)。系统完全运行在用户苹果手机本地，无需外部服务器支持。</w:t>
-      </w:r>
-    </w:p>
-    <w:p>
-      <w:r>
-        <w:t>• 数据持久化：利用浏览器 LocalStorage 或 IndexedDB 实现本地持久化方案，确保用户数据安全存储于设备本地且支持离线使用。</w:t>
-      </w:r>
-    </w:p>
-    <w:p>
-      <w:r>
-        <w:t>• 响应式设计：适配 iOS 各种屏幕尺寸及灵动岛等硬件特性。</w:t>
-      </w:r>
-    </w:p>
-    <w:p>
-      <w:r>
-        <w:t>• 动画引擎：底层需结合 Framer Motion 或 Canvas 实现复杂的物理粒子效果。</w:t>
-      </w:r>
-    </w:p>
-    <w:p>
-      <w:r>
-        <w:t>• 交互性能：保持 60/120 FPS 的极致流畅度，满足用户感官预期。</w:t>
+        <w:t>• 本地持久化保证数据完全归属于用户设备。</w:t>
       </w:r>
     </w:p>
     <w:sectPr>

</xml_diff>